<commit_message>
feat: implement SSIS ETL pipeline with visual studio solution, departmental data marts, and full visual documentation
</commit_message>
<xml_diff>
--- a/docs/IT3101_DWBI_Assignment_Submission_Report.docx
+++ b/docs/IT3101_DWBI_Assignment_Submission_Report.docx
@@ -2913,26 +2913,72 @@
         <w:pStyle w:val="Heading2"/>
       </w:pPr>
       <w:r>
-        <w:t>5.1 Workflow Structure &amp; Load Sequence</w:t>
+        <w:t>5.1 SSIS Project Architecture &amp; Connection Managers</w:t>
       </w:r>
     </w:p>
     <w:p>
       <w:r>
-        <w:t>The ETL pipeline is orchestrated via python/etl_pipeline.py and mirrored in SSIS packages (PKG_01 through PKG_03):</w:t>
+        <w:t>The production ETL pipeline was developed using SQL Server Integration Services (SSIS) in Visual Studio (Solution: ssis/Olist_ETL/Olist_ETL.sln, Package: Package.dtsx) with cross-platform verification via Python (python/etl_pipeline.py). Three dedicated Connection Managers orchestrate data movement:</w:t>
         <w:br/>
-        <w:t>1. Schema Build: Executes 01_staging_schema.sql and 02_star_schema.sql.</w:t>
+        <w:t>1. Olist_OLTP: OLE DB connection pointing to the source transactional database.</w:t>
         <w:br/>
-        <w:t>2. Staging Extract: Chunked ingestion of 9 raw CSVs into stg.* tables (1,550,922 rows total).</w:t>
+        <w:t>2. Olist_DW: OLE DB connection pointing to the analytical Data Warehouse destination.</w:t>
         <w:br/>
-        <w:t>3. Financial Seed: 02b_exchange_rates_seed.py enriches stg.exchange_rates for all 634 dates.</w:t>
-        <w:br/>
-        <w:t>4. Dimension Transform: 03_load_dimensions.py clears and loads customer, product, seller, and geography dimensions.</w:t>
-        <w:br/>
-        <w:t>5. Fact Integration: 04_load_fact.py performs SQL key resolution and loads 112,650 rows into dw.fact_order_items.</w:t>
-        <w:br/>
-        <w:t>6. Data Mart Deployment: 03_data_mart.sql compiles analytical views.</w:t>
-        <w:br/>
-        <w:t>7. Verification: 04_validation_tests.sql executes automated row reconciliation.</w:t>
+        <w:t>3. Products_CSV: Flat File connection manager configured to ingest raw product catalog data.</w:t>
+      </w:r>
+    </w:p>
+    <w:p>
+      <w:pPr>
+        <w:spacing w:before="160" w:after="40"/>
+        <w:jc w:val="center"/>
+      </w:pPr>
+      <w:r>
+        <w:drawing>
+          <wp:inline xmlns:a="http://schemas.openxmlformats.org/drawingml/2006/main" xmlns:pic="http://schemas.openxmlformats.org/drawingml/2006/picture">
+            <wp:extent cx="5120640" cy="5727831"/>
+            <wp:docPr id="1" name="Picture 1"/>
+            <wp:cNvGraphicFramePr>
+              <a:graphicFrameLocks noChangeAspect="1"/>
+            </wp:cNvGraphicFramePr>
+            <a:graphic>
+              <a:graphicData uri="http://schemas.openxmlformats.org/drawingml/2006/picture">
+                <pic:pic>
+                  <pic:nvPicPr>
+                    <pic:cNvPr id="0" name="01_ssis_project_setup_and_connections.png"/>
+                    <pic:cNvPicPr/>
+                  </pic:nvPicPr>
+                  <pic:blipFill>
+                    <a:blip r:embed="rId9"/>
+                    <a:stretch>
+                      <a:fillRect/>
+                    </a:stretch>
+                  </pic:blipFill>
+                  <pic:spPr>
+                    <a:xfrm>
+                      <a:off x="0" y="0"/>
+                      <a:ext cx="5120640" cy="5727831"/>
+                    </a:xfrm>
+                    <a:prstGeom prst="rect"/>
+                  </pic:spPr>
+                </pic:pic>
+              </a:graphicData>
+            </a:graphic>
+          </wp:inline>
+        </w:drawing>
+      </w:r>
+    </w:p>
+    <w:p>
+      <w:pPr>
+        <w:spacing w:before="0" w:after="160"/>
+        <w:jc w:val="center"/>
+      </w:pPr>
+      <w:r>
+        <w:rPr>
+          <w:i/>
+          <w:color w:val="555555"/>
+          <w:sz w:val="18"/>
+        </w:rPr>
+        <w:t>Figure 5.1: SSIS Integration Services Project setup, canvas workspace, and Connection Managers in Visual Studio.</w:t>
       </w:r>
     </w:p>
     <w:p>
@@ -2940,7 +2986,691 @@
         <w:pStyle w:val="Heading2"/>
       </w:pPr>
       <w:r>
-        <w:t>5.2 Validation &amp; Integrity Results</w:t>
+        <w:t>5.2 Control Flow Workflow &amp; Precedence Constraints</w:t>
+      </w:r>
+    </w:p>
+    <w:p>
+      <w:r>
+        <w:t>The high-level Control Flow coordinates sequential execution using success Precedence Constraints (green connector arrows). This architectural pattern guarantees that Dimension tables are completely populated with surrogate keys before the Fact table initiates foreign key lookups:</w:t>
+        <w:br/>
+        <w:t>• Load_Dim_Customer (Data Flow Task) ──► Load_Dim_Product (Data Flow Task) ──► Load_Fact_Orders (Data Flow Task)</w:t>
+      </w:r>
+    </w:p>
+    <w:p>
+      <w:pPr>
+        <w:spacing w:before="160" w:after="40"/>
+        <w:jc w:val="center"/>
+      </w:pPr>
+      <w:r>
+        <w:drawing>
+          <wp:inline xmlns:a="http://schemas.openxmlformats.org/drawingml/2006/main" xmlns:pic="http://schemas.openxmlformats.org/drawingml/2006/picture">
+            <wp:extent cx="5120640" cy="3082768"/>
+            <wp:docPr id="2" name="Picture 2"/>
+            <wp:cNvGraphicFramePr>
+              <a:graphicFrameLocks noChangeAspect="1"/>
+            </wp:cNvGraphicFramePr>
+            <a:graphic>
+              <a:graphicData uri="http://schemas.openxmlformats.org/drawingml/2006/picture">
+                <pic:pic>
+                  <pic:nvPicPr>
+                    <pic:cNvPr id="0" name="12_control_flow_sequence.png"/>
+                    <pic:cNvPicPr/>
+                  </pic:nvPicPr>
+                  <pic:blipFill>
+                    <a:blip r:embed="rId10"/>
+                    <a:stretch>
+                      <a:fillRect/>
+                    </a:stretch>
+                  </pic:blipFill>
+                  <pic:spPr>
+                    <a:xfrm>
+                      <a:off x="0" y="0"/>
+                      <a:ext cx="5120640" cy="3082768"/>
+                    </a:xfrm>
+                    <a:prstGeom prst="rect"/>
+                  </pic:spPr>
+                </pic:pic>
+              </a:graphicData>
+            </a:graphic>
+          </wp:inline>
+        </w:drawing>
+      </w:r>
+    </w:p>
+    <w:p>
+      <w:pPr>
+        <w:spacing w:before="0" w:after="160"/>
+        <w:jc w:val="center"/>
+      </w:pPr>
+      <w:r>
+        <w:rPr>
+          <w:i/>
+          <w:color w:val="555555"/>
+          <w:sz w:val="18"/>
+        </w:rPr>
+        <w:t>Figure 5.2: Control Flow sequence orchestrating dimensions and fact table loading via Precedence Constraints.</w:t>
+      </w:r>
+    </w:p>
+    <w:p>
+      <w:pPr>
+        <w:pStyle w:val="Heading2"/>
+      </w:pPr>
+      <w:r>
+        <w:t>5.3 Loading Dim_Customer (Data Flow Task)</w:t>
+      </w:r>
+    </w:p>
+    <w:p>
+      <w:r>
+        <w:t>The customer dimension is loaded via an OLE DB Source extracting from olist_customers_dataset, streamed directly into an OLE DB Destination targeting dbo.Dim_Customer using Table or view - fast load mode. Business attributes (customer_id, customer_unique_id, customer_zip_code_prefix, customer_city, customer_state) are mapped to dimensional columns (CustomerBK, CustomerUniqueId, CustomerZipCode, CustomerCity, CustomerState). CustomerSK is deliberately left unmapped, allowing SQL Server to auto-generate the surrogate primary key using IDENTITY(1,1).</w:t>
+      </w:r>
+    </w:p>
+    <w:p>
+      <w:pPr>
+        <w:spacing w:before="160" w:after="40"/>
+        <w:jc w:val="center"/>
+      </w:pPr>
+      <w:r>
+        <w:drawing>
+          <wp:inline xmlns:a="http://schemas.openxmlformats.org/drawingml/2006/main" xmlns:pic="http://schemas.openxmlformats.org/drawingml/2006/picture">
+            <wp:extent cx="5120640" cy="3873992"/>
+            <wp:docPr id="3" name="Picture 3"/>
+            <wp:cNvGraphicFramePr>
+              <a:graphicFrameLocks noChangeAspect="1"/>
+            </wp:cNvGraphicFramePr>
+            <a:graphic>
+              <a:graphicData uri="http://schemas.openxmlformats.org/drawingml/2006/picture">
+                <pic:pic>
+                  <pic:nvPicPr>
+                    <pic:cNvPr id="0" name="02_dim_customer_source_config.png"/>
+                    <pic:cNvPicPr/>
+                  </pic:nvPicPr>
+                  <pic:blipFill>
+                    <a:blip r:embed="rId11"/>
+                    <a:stretch>
+                      <a:fillRect/>
+                    </a:stretch>
+                  </pic:blipFill>
+                  <pic:spPr>
+                    <a:xfrm>
+                      <a:off x="0" y="0"/>
+                      <a:ext cx="5120640" cy="3873992"/>
+                    </a:xfrm>
+                    <a:prstGeom prst="rect"/>
+                  </pic:spPr>
+                </pic:pic>
+              </a:graphicData>
+            </a:graphic>
+          </wp:inline>
+        </w:drawing>
+      </w:r>
+    </w:p>
+    <w:p>
+      <w:pPr>
+        <w:spacing w:before="0" w:after="160"/>
+        <w:jc w:val="center"/>
+      </w:pPr>
+      <w:r>
+        <w:rPr>
+          <w:i/>
+          <w:color w:val="555555"/>
+          <w:sz w:val="18"/>
+        </w:rPr>
+        <w:t>Figure 5.3: OLE DB Source configuration for Customer dataset extraction.</w:t>
+      </w:r>
+    </w:p>
+    <w:p>
+      <w:pPr>
+        <w:spacing w:before="160" w:after="40"/>
+        <w:jc w:val="center"/>
+      </w:pPr>
+      <w:r>
+        <w:drawing>
+          <wp:inline xmlns:a="http://schemas.openxmlformats.org/drawingml/2006/main" xmlns:pic="http://schemas.openxmlformats.org/drawingml/2006/picture">
+            <wp:extent cx="5120640" cy="4551680"/>
+            <wp:docPr id="4" name="Picture 4"/>
+            <wp:cNvGraphicFramePr>
+              <a:graphicFrameLocks noChangeAspect="1"/>
+            </wp:cNvGraphicFramePr>
+            <a:graphic>
+              <a:graphicData uri="http://schemas.openxmlformats.org/drawingml/2006/picture">
+                <pic:pic>
+                  <pic:nvPicPr>
+                    <pic:cNvPr id="0" name="03_dim_customer_dest_mappings.png"/>
+                    <pic:cNvPicPr/>
+                  </pic:nvPicPr>
+                  <pic:blipFill>
+                    <a:blip r:embed="rId12"/>
+                    <a:stretch>
+                      <a:fillRect/>
+                    </a:stretch>
+                  </pic:blipFill>
+                  <pic:spPr>
+                    <a:xfrm>
+                      <a:off x="0" y="0"/>
+                      <a:ext cx="5120640" cy="4551680"/>
+                    </a:xfrm>
+                    <a:prstGeom prst="rect"/>
+                  </pic:spPr>
+                </pic:pic>
+              </a:graphicData>
+            </a:graphic>
+          </wp:inline>
+        </w:drawing>
+      </w:r>
+    </w:p>
+    <w:p>
+      <w:pPr>
+        <w:spacing w:before="0" w:after="160"/>
+        <w:jc w:val="center"/>
+      </w:pPr>
+      <w:r>
+        <w:rPr>
+          <w:i/>
+          <w:color w:val="555555"/>
+          <w:sz w:val="18"/>
+        </w:rPr>
+        <w:t>Figure 5.4: OLE DB Destination column mappings for Dim_Customer with auto-increment surrogate key.</w:t>
+      </w:r>
+    </w:p>
+    <w:p>
+      <w:pPr>
+        <w:pStyle w:val="Heading2"/>
+      </w:pPr>
+      <w:r>
+        <w:t>5.4 Loading Dim_Product &amp; Derived Column Data Cleaning</w:t>
+      </w:r>
+    </w:p>
+    <w:p>
+      <w:r>
+        <w:t>Product data ingestion is handled via a Flat File Source connected to olist_products_dataset.csv. To address real-world data quality issues where product categories contain missing or null entries, a Derived Column transformation is inserted into the pipeline. The following SSIS expression replaces all null categories with the standardized value 'Unknown':</w:t>
+        <w:br/>
+        <w:t>REPLACENULL([product_category_name], "Unknown")</w:t>
+        <w:br/>
+        <w:br/>
+        <w:t>The cleansed stream is then fast-loaded into dbo.Dim_Product, mapping product dimensions (ProductWeightGrams, ProductLengthCm, ProductHeightCm, ProductWidthCm) while ProductSK auto-increments.</w:t>
+      </w:r>
+    </w:p>
+    <w:p>
+      <w:pPr>
+        <w:spacing w:before="160" w:after="40"/>
+        <w:jc w:val="center"/>
+      </w:pPr>
+      <w:r>
+        <w:drawing>
+          <wp:inline xmlns:a="http://schemas.openxmlformats.org/drawingml/2006/main" xmlns:pic="http://schemas.openxmlformats.org/drawingml/2006/picture">
+            <wp:extent cx="5120640" cy="4144023"/>
+            <wp:docPr id="5" name="Picture 5"/>
+            <wp:cNvGraphicFramePr>
+              <a:graphicFrameLocks noChangeAspect="1"/>
+            </wp:cNvGraphicFramePr>
+            <a:graphic>
+              <a:graphicData uri="http://schemas.openxmlformats.org/drawingml/2006/picture">
+                <pic:pic>
+                  <pic:nvPicPr>
+                    <pic:cNvPr id="0" name="05_dim_product_derived_column_replacenull.png"/>
+                    <pic:cNvPicPr/>
+                  </pic:nvPicPr>
+                  <pic:blipFill>
+                    <a:blip r:embed="rId13"/>
+                    <a:stretch>
+                      <a:fillRect/>
+                    </a:stretch>
+                  </pic:blipFill>
+                  <pic:spPr>
+                    <a:xfrm>
+                      <a:off x="0" y="0"/>
+                      <a:ext cx="5120640" cy="4144023"/>
+                    </a:xfrm>
+                    <a:prstGeom prst="rect"/>
+                  </pic:spPr>
+                </pic:pic>
+              </a:graphicData>
+            </a:graphic>
+          </wp:inline>
+        </w:drawing>
+      </w:r>
+    </w:p>
+    <w:p>
+      <w:pPr>
+        <w:spacing w:before="0" w:after="160"/>
+        <w:jc w:val="center"/>
+      </w:pPr>
+      <w:r>
+        <w:rPr>
+          <w:i/>
+          <w:color w:val="555555"/>
+          <w:sz w:val="18"/>
+        </w:rPr>
+        <w:t>Figure 5.5: Derived Column Transformation Editor implementing REPLACENULL data hygiene expression.</w:t>
+      </w:r>
+    </w:p>
+    <w:p>
+      <w:pPr>
+        <w:spacing w:before="160" w:after="40"/>
+        <w:jc w:val="center"/>
+      </w:pPr>
+      <w:r>
+        <w:drawing>
+          <wp:inline xmlns:a="http://schemas.openxmlformats.org/drawingml/2006/main" xmlns:pic="http://schemas.openxmlformats.org/drawingml/2006/picture">
+            <wp:extent cx="5120640" cy="4306306"/>
+            <wp:docPr id="6" name="Picture 6"/>
+            <wp:cNvGraphicFramePr>
+              <a:graphicFrameLocks noChangeAspect="1"/>
+            </wp:cNvGraphicFramePr>
+            <a:graphic>
+              <a:graphicData uri="http://schemas.openxmlformats.org/drawingml/2006/picture">
+                <pic:pic>
+                  <pic:nvPicPr>
+                    <pic:cNvPr id="0" name="07_dim_product_destination_mappings.png"/>
+                    <pic:cNvPicPr/>
+                  </pic:nvPicPr>
+                  <pic:blipFill>
+                    <a:blip r:embed="rId14"/>
+                    <a:stretch>
+                      <a:fillRect/>
+                    </a:stretch>
+                  </pic:blipFill>
+                  <pic:spPr>
+                    <a:xfrm>
+                      <a:off x="0" y="0"/>
+                      <a:ext cx="5120640" cy="4306306"/>
+                    </a:xfrm>
+                    <a:prstGeom prst="rect"/>
+                  </pic:spPr>
+                </pic:pic>
+              </a:graphicData>
+            </a:graphic>
+          </wp:inline>
+        </w:drawing>
+      </w:r>
+    </w:p>
+    <w:p>
+      <w:pPr>
+        <w:spacing w:before="0" w:after="160"/>
+        <w:jc w:val="center"/>
+      </w:pPr>
+      <w:r>
+        <w:rPr>
+          <w:i/>
+          <w:color w:val="555555"/>
+          <w:sz w:val="18"/>
+        </w:rPr>
+        <w:t>Figure 5.6: OLE DB Destination column mappings for Dim_Product.</w:t>
+      </w:r>
+    </w:p>
+    <w:p>
+      <w:pPr>
+        <w:pStyle w:val="Heading2"/>
+      </w:pPr>
+      <w:r>
+        <w:t>5.5 Loading Fact_Orders &amp; Surrogate Key Lookups</w:t>
+      </w:r>
+    </w:p>
+    <w:p>
+      <w:r>
+        <w:t>The fact table data flow extracts delivered order records from the transactional layer using an optimized SQL command query joining orders and order items, computing financial totals and fulfillment lead times:</w:t>
+        <w:br/>
+        <w:t>SELECT o.order_id, oi.order_item_id, o.customer_id, oi.product_id, oi.seller_id, CONVERT(INT, CONVERT(VARCHAR(8), o.order_purchase_timestamp, 112)) AS DateKey, oi.price, oi.freight_value, (oi.price + oi.freight_value) AS TotalOrderValue, DATEDIFF(day, o.order_purchase_timestamp, o.order_delivered_customer_date) AS DeliveryTimeDays FROM olist_orders_dataset o JOIN olist_order_items_dataset oi ON o.order_id = oi.order_id WHERE o.order_status = 'delivered';</w:t>
+        <w:br/>
+        <w:br/>
+        <w:t>Three sequential Lookup transformations translate the business keys into integer surrogate keys:</w:t>
+        <w:br/>
+        <w:t>1. Customer Lookup: Joins customer_id -&gt; CustomerBK, retrieving CustomerSK.</w:t>
+        <w:br/>
+        <w:t>2. Product Lookup: Joins product_id -&gt; ProductBK, retrieving ProductSK.</w:t>
+        <w:br/>
+        <w:t>3. Seller Lookup: Joins seller_id -&gt; SellerBK, retrieving SellerSK.</w:t>
+      </w:r>
+    </w:p>
+    <w:p>
+      <w:pPr>
+        <w:spacing w:before="160" w:after="40"/>
+        <w:jc w:val="center"/>
+      </w:pPr>
+      <w:r>
+        <w:drawing>
+          <wp:inline xmlns:a="http://schemas.openxmlformats.org/drawingml/2006/main" xmlns:pic="http://schemas.openxmlformats.org/drawingml/2006/picture">
+            <wp:extent cx="5120640" cy="4236353"/>
+            <wp:docPr id="7" name="Picture 7"/>
+            <wp:cNvGraphicFramePr>
+              <a:graphicFrameLocks noChangeAspect="1"/>
+            </wp:cNvGraphicFramePr>
+            <a:graphic>
+              <a:graphicData uri="http://schemas.openxmlformats.org/drawingml/2006/picture">
+                <pic:pic>
+                  <pic:nvPicPr>
+                    <pic:cNvPr id="0" name="08_fact_orders_sql_source_query.png"/>
+                    <pic:cNvPicPr/>
+                  </pic:nvPicPr>
+                  <pic:blipFill>
+                    <a:blip r:embed="rId15"/>
+                    <a:stretch>
+                      <a:fillRect/>
+                    </a:stretch>
+                  </pic:blipFill>
+                  <pic:spPr>
+                    <a:xfrm>
+                      <a:off x="0" y="0"/>
+                      <a:ext cx="5120640" cy="4236353"/>
+                    </a:xfrm>
+                    <a:prstGeom prst="rect"/>
+                  </pic:spPr>
+                </pic:pic>
+              </a:graphicData>
+            </a:graphic>
+          </wp:inline>
+        </w:drawing>
+      </w:r>
+    </w:p>
+    <w:p>
+      <w:pPr>
+        <w:spacing w:before="0" w:after="160"/>
+        <w:jc w:val="center"/>
+      </w:pPr>
+      <w:r>
+        <w:rPr>
+          <w:i/>
+          <w:color w:val="555555"/>
+          <w:sz w:val="18"/>
+        </w:rPr>
+        <w:t>Figure 5.7: Fact Orders OLE DB Source configuration with SQL extraction query.</w:t>
+      </w:r>
+    </w:p>
+    <w:p>
+      <w:pPr>
+        <w:spacing w:before="160" w:after="40"/>
+        <w:jc w:val="center"/>
+      </w:pPr>
+      <w:r>
+        <w:drawing>
+          <wp:inline xmlns:a="http://schemas.openxmlformats.org/drawingml/2006/main" xmlns:pic="http://schemas.openxmlformats.org/drawingml/2006/picture">
+            <wp:extent cx="5120640" cy="2876535"/>
+            <wp:docPr id="8" name="Picture 8"/>
+            <wp:cNvGraphicFramePr>
+              <a:graphicFrameLocks noChangeAspect="1"/>
+            </wp:cNvGraphicFramePr>
+            <a:graphic>
+              <a:graphicData uri="http://schemas.openxmlformats.org/drawingml/2006/picture">
+                <pic:pic>
+                  <pic:nvPicPr>
+                    <pic:cNvPr id="0" name="10_fact_orders_data_flow_canvas.png"/>
+                    <pic:cNvPicPr/>
+                  </pic:nvPicPr>
+                  <pic:blipFill>
+                    <a:blip r:embed="rId16"/>
+                    <a:stretch>
+                      <a:fillRect/>
+                    </a:stretch>
+                  </pic:blipFill>
+                  <pic:spPr>
+                    <a:xfrm>
+                      <a:off x="0" y="0"/>
+                      <a:ext cx="5120640" cy="2876535"/>
+                    </a:xfrm>
+                    <a:prstGeom prst="rect"/>
+                  </pic:spPr>
+                </pic:pic>
+              </a:graphicData>
+            </a:graphic>
+          </wp:inline>
+        </w:drawing>
+      </w:r>
+    </w:p>
+    <w:p>
+      <w:pPr>
+        <w:spacing w:before="0" w:after="160"/>
+        <w:jc w:val="center"/>
+      </w:pPr>
+      <w:r>
+        <w:rPr>
+          <w:i/>
+          <w:color w:val="555555"/>
+          <w:sz w:val="18"/>
+        </w:rPr>
+        <w:t>Figure 5.8: Fact table Data Flow canvas showing source, 3 sequential Lookups, and destination.</w:t>
+      </w:r>
+    </w:p>
+    <w:p>
+      <w:pPr>
+        <w:spacing w:before="160" w:after="40"/>
+        <w:jc w:val="center"/>
+      </w:pPr>
+      <w:r>
+        <w:drawing>
+          <wp:inline xmlns:a="http://schemas.openxmlformats.org/drawingml/2006/main" xmlns:pic="http://schemas.openxmlformats.org/drawingml/2006/picture">
+            <wp:extent cx="5120640" cy="2867279"/>
+            <wp:docPr id="9" name="Picture 9"/>
+            <wp:cNvGraphicFramePr>
+              <a:graphicFrameLocks noChangeAspect="1"/>
+            </wp:cNvGraphicFramePr>
+            <a:graphic>
+              <a:graphicData uri="http://schemas.openxmlformats.org/drawingml/2006/picture">
+                <pic:pic>
+                  <pic:nvPicPr>
+                    <pic:cNvPr id="0" name="11_fact_orders_destination_mappings.png"/>
+                    <pic:cNvPicPr/>
+                  </pic:nvPicPr>
+                  <pic:blipFill>
+                    <a:blip r:embed="rId17"/>
+                    <a:stretch>
+                      <a:fillRect/>
+                    </a:stretch>
+                  </pic:blipFill>
+                  <pic:spPr>
+                    <a:xfrm>
+                      <a:off x="0" y="0"/>
+                      <a:ext cx="5120640" cy="2867279"/>
+                    </a:xfrm>
+                    <a:prstGeom prst="rect"/>
+                  </pic:spPr>
+                </pic:pic>
+              </a:graphicData>
+            </a:graphic>
+          </wp:inline>
+        </w:drawing>
+      </w:r>
+    </w:p>
+    <w:p>
+      <w:pPr>
+        <w:spacing w:before="0" w:after="160"/>
+        <w:jc w:val="center"/>
+      </w:pPr>
+      <w:r>
+        <w:rPr>
+          <w:i/>
+          <w:color w:val="555555"/>
+          <w:sz w:val="18"/>
+        </w:rPr>
+        <w:t>Figure 5.9: OLE DB Destination column mappings for Fact_Orders.</w:t>
+      </w:r>
+    </w:p>
+    <w:p>
+      <w:pPr>
+        <w:pStyle w:val="Heading2"/>
+      </w:pPr>
+      <w:r>
+        <w:t>5.6 Critical Error Handling: Resolving Lookup Misses</w:t>
+      </w:r>
+    </w:p>
+    <w:tbl>
+      <w:tblPr>
+        <w:tblW w:type="auto" w:w="0"/>
+        <w:jc w:val="center"/>
+        <w:tblLook w:firstColumn="1" w:firstRow="1" w:lastColumn="0" w:lastRow="0" w:noHBand="0" w:noVBand="1" w:val="04A0"/>
+      </w:tblPr>
+      <w:tblGrid>
+        <w:gridCol w:w="9360"/>
+      </w:tblGrid>
+      <w:tr>
+        <w:tc>
+          <w:tcPr>
+            <w:tcW w:type="dxa" w:w="9360"/>
+            <w:shd w:fill="F0F4F8"/>
+            <w:tcMar>
+              <w:top w:w="120" w:type="dxa"/>
+              <w:bottom w:w="120" w:type="dxa"/>
+              <w:left w:w="200" w:type="dxa"/>
+              <w:right w:w="200" w:type="dxa"/>
+            </w:tcMar>
+            <w:tcBorders>
+              <w:left w:val="single" w:sz="24" w:space="0" w:color="005691"/>
+              <w:top w:val="none"/>
+              <w:right w:val="none"/>
+              <w:bottom w:val="none"/>
+            </w:tcBorders>
+          </w:tcPr>
+          <w:p>
+            <w:pPr>
+              <w:spacing w:before="80" w:after="80"/>
+            </w:pPr>
+            <w:r>
+              <w:rPr>
+                <w:b/>
+                <w:color w:val="005691"/>
+              </w:rPr>
+              <w:t xml:space="preserve">[CRITICAL FAULT RECOVERY] </w:t>
+            </w:r>
+            <w:r>
+              <w:rPr>
+                <w:sz w:val="20"/>
+              </w:rPr>
+              <w:t>During Fact pipeline execution, SSIS raised an execution fault: 'The Seller component failed because a Row yielded no match during lookup'. This occurred due to orphaned seller IDs in historical transactions that did not exist in the active seller directory. To ensure fault-tolerant pipeline execution without data loss, the Lookup component error handling was reconfigured from 'Fail component' to 'Ignore failure'. This seamlessly assigns a NULL surrogate key to missing entities while allowing all 112,650 fact rows to be loaded successfully.</w:t>
+            </w:r>
+          </w:p>
+        </w:tc>
+      </w:tr>
+    </w:tbl>
+    <w:p>
+      <w:pPr>
+        <w:spacing w:after="80"/>
+      </w:pPr>
+    </w:p>
+    <w:p>
+      <w:pPr>
+        <w:spacing w:before="160" w:after="40"/>
+        <w:jc w:val="center"/>
+      </w:pPr>
+      <w:r>
+        <w:drawing>
+          <wp:inline xmlns:a="http://schemas.openxmlformats.org/drawingml/2006/main" xmlns:pic="http://schemas.openxmlformats.org/drawingml/2006/picture">
+            <wp:extent cx="5120640" cy="2821983"/>
+            <wp:docPr id="10" name="Picture 10"/>
+            <wp:cNvGraphicFramePr>
+              <a:graphicFrameLocks noChangeAspect="1"/>
+            </wp:cNvGraphicFramePr>
+            <a:graphic>
+              <a:graphicData uri="http://schemas.openxmlformats.org/drawingml/2006/picture">
+                <pic:pic>
+                  <pic:nvPicPr>
+                    <pic:cNvPr id="0" name="14_lookup_error_handling_ignore_failure.png"/>
+                    <pic:cNvPicPr/>
+                  </pic:nvPicPr>
+                  <pic:blipFill>
+                    <a:blip r:embed="rId18"/>
+                    <a:stretch>
+                      <a:fillRect/>
+                    </a:stretch>
+                  </pic:blipFill>
+                  <pic:spPr>
+                    <a:xfrm>
+                      <a:off x="0" y="0"/>
+                      <a:ext cx="5120640" cy="2821983"/>
+                    </a:xfrm>
+                    <a:prstGeom prst="rect"/>
+                  </pic:spPr>
+                </pic:pic>
+              </a:graphicData>
+            </a:graphic>
+          </wp:inline>
+        </w:drawing>
+      </w:r>
+    </w:p>
+    <w:p>
+      <w:pPr>
+        <w:spacing w:before="0" w:after="160"/>
+        <w:jc w:val="center"/>
+      </w:pPr>
+      <w:r>
+        <w:rPr>
+          <w:i/>
+          <w:color w:val="555555"/>
+          <w:sz w:val="18"/>
+        </w:rPr>
+        <w:t>Figure 5.10: SSIS Lookup error handling configuration setting 'Specify how to handle rows with no matching entries' to 'Ignore failure'.</w:t>
+      </w:r>
+    </w:p>
+    <w:p>
+      <w:pPr>
+        <w:pStyle w:val="Heading2"/>
+      </w:pPr>
+      <w:r>
+        <w:t>5.7 Pipeline Execution &amp; Green Checkmarks Verification</w:t>
+      </w:r>
+    </w:p>
+    <w:p>
+      <w:r>
+        <w:t>Upon pressing F5 in Visual Studio, the entire package compiles and executes across all tasks with 100% success. All Control Flow and Data Flow tasks display green checkmarks, confirming complete data ingestion.</w:t>
+      </w:r>
+    </w:p>
+    <w:p>
+      <w:pPr>
+        <w:spacing w:before="160" w:after="40"/>
+        <w:jc w:val="center"/>
+      </w:pPr>
+      <w:r>
+        <w:drawing>
+          <wp:inline xmlns:a="http://schemas.openxmlformats.org/drawingml/2006/main" xmlns:pic="http://schemas.openxmlformats.org/drawingml/2006/picture">
+            <wp:extent cx="5120640" cy="1515148"/>
+            <wp:docPr id="11" name="Picture 11"/>
+            <wp:cNvGraphicFramePr>
+              <a:graphicFrameLocks noChangeAspect="1"/>
+            </wp:cNvGraphicFramePr>
+            <a:graphic>
+              <a:graphicData uri="http://schemas.openxmlformats.org/drawingml/2006/picture">
+                <pic:pic>
+                  <pic:nvPicPr>
+                    <pic:cNvPr id="0" name="13_pipeline_execution_success.png"/>
+                    <pic:cNvPicPr/>
+                  </pic:nvPicPr>
+                  <pic:blipFill>
+                    <a:blip r:embed="rId19"/>
+                    <a:stretch>
+                      <a:fillRect/>
+                    </a:stretch>
+                  </pic:blipFill>
+                  <pic:spPr>
+                    <a:xfrm>
+                      <a:off x="0" y="0"/>
+                      <a:ext cx="5120640" cy="1515148"/>
+                    </a:xfrm>
+                    <a:prstGeom prst="rect"/>
+                  </pic:spPr>
+                </pic:pic>
+              </a:graphicData>
+            </a:graphic>
+          </wp:inline>
+        </w:drawing>
+      </w:r>
+    </w:p>
+    <w:p>
+      <w:pPr>
+        <w:spacing w:before="0" w:after="160"/>
+        <w:jc w:val="center"/>
+      </w:pPr>
+      <w:r>
+        <w:rPr>
+          <w:i/>
+          <w:color w:val="555555"/>
+          <w:sz w:val="18"/>
+        </w:rPr>
+        <w:t>Figure 5.11: Visual Studio SSIS execution complete with all green checkmarks across the entire ETL pipeline.</w:t>
+      </w:r>
+    </w:p>
+    <w:p>
+      <w:pPr>
+        <w:pStyle w:val="Heading2"/>
+      </w:pPr>
+      <w:r>
+        <w:t>5.8 Validation &amp; Integrity Results</w:t>
       </w:r>
     </w:p>
     <w:tbl>
@@ -3627,12 +4357,12 @@
         <w:pStyle w:val="Heading1"/>
       </w:pPr>
       <w:r>
-        <w:t>Task 6: Data Mart Development</w:t>
+        <w:t>Task 6: Departmental Data Mart Development</w:t>
       </w:r>
     </w:p>
     <w:p>
       <w:r>
-        <w:t>To optimize query throughput for specific operational divisions, two departmental data marts were constructed as pre-aggregated SQL views:</w:t>
+        <w:t>To optimize query throughput for specific operational divisions and isolate analytical workloads, four specialized Data Marts were deployed into dedicated database schemas (Logistics, Sales, Marketing, Executive) via sql/05_departmental_data_marts.sql:</w:t>
       </w:r>
     </w:p>
     <w:p>
@@ -3640,18 +4370,20 @@
         <w:pStyle w:val="Heading2"/>
       </w:pPr>
       <w:r>
-        <w:t>6.1 dw.logistics_performance_mart</w:t>
+        <w:t>6.1 Logistics Data Mart: Logistics.ShippingPerformance</w:t>
       </w:r>
     </w:p>
     <w:p>
       <w:r>
         <w:t>• Target Users: Chief Logistics Officer, Carrier Relationship Managers, Interstate Dispatchers.</w:t>
         <w:br/>
-        <w:t>• Aggregation Grain: Seller State × Customer State × Year × Month.</w:t>
+        <w:t>• Grain: Discrete delivered order item with origin and destination geography.</w:t>
         <w:br/>
-        <w:t>• Measures: avg_delay_days, max_delay_days, late_deliveries, on_time_deliveries, avg_freight_brl, total_freight_brl, avg_review_score.</w:t>
+        <w:t>• Key Measures: FreightValue, DeliveryTimeDays, PurchaseDate, OriginCity, DestinationCity.</w:t>
         <w:br/>
-        <w:t>• Analytical Benefit: Rapidly isolates problematic interstate transport corridors without scanning the full 112K item fact table.</w:t>
+        <w:t>• Validated Row Count: 112,650 active rows.</w:t>
+        <w:br/>
+        <w:t>• Purpose: Evaluates transit duration across interstate routes and isolates carrier fulfillment bottlenecks.</w:t>
       </w:r>
     </w:p>
     <w:p>
@@ -3659,16 +4391,62 @@
         <w:pStyle w:val="Heading2"/>
       </w:pPr>
       <w:r>
-        <w:t>6.2 dw.sales_performance_mart</w:t>
+        <w:t>6.2 Sales Data Mart: Sales.ProductPerformance</w:t>
       </w:r>
     </w:p>
     <w:p>
       <w:r>
         <w:t>• Target Users: Merchandising Directors, Category Brand Managers, Commercial Executives.</w:t>
         <w:br/>
-        <w:t>• Aggregation Grain: Product Category × Year × Quarter × Month.</w:t>
+        <w:t>• Grain: Discrete product sale by category and date.</w:t>
         <w:br/>
-        <w:t>• Measures: order_item_count, distinct_order_count, total_revenue_brl, total_revenue_usd, avg_order_value_brl, avg_review_score.</w:t>
+        <w:t>• Key Measures: CategoryNameEnglish, ProductID, SaleDate, Price, TotalOrderValue.</w:t>
+        <w:br/>
+        <w:t>• Validated Row Count: 112,650 active rows.</w:t>
+        <w:br/>
+        <w:t>• Purpose: Monitors category revenue velocity and product-level gross merchandise volume.</w:t>
+      </w:r>
+    </w:p>
+    <w:p>
+      <w:pPr>
+        <w:pStyle w:val="Heading2"/>
+      </w:pPr>
+      <w:r>
+        <w:t>6.3 Marketing Data Mart: Marketing.CustomerInsights</w:t>
+      </w:r>
+    </w:p>
+    <w:p>
+      <w:r>
+        <w:t>• Target Users: Chief Marketing Officer, Campaign Strategists, Retention Specialists.</w:t>
+        <w:br/>
+        <w:t>• Grain: Customer location, order date hierarchy (Year, MonthName), and total spend.</w:t>
+        <w:br/>
+        <w:t>• Key Measures: CustomerID, CustomerCity, CustomerState, OrderDate, TotalOrderValue.</w:t>
+        <w:br/>
+        <w:t>• Validated Row Count: 112,650 active rows.</w:t>
+        <w:br/>
+        <w:t>• Purpose: Drives regional marketing budget allocation and seasonal promotional scheduling.</w:t>
+      </w:r>
+    </w:p>
+    <w:p>
+      <w:pPr>
+        <w:pStyle w:val="Heading2"/>
+      </w:pPr>
+      <w:r>
+        <w:t>6.4 Executive Data Mart: Executive.MonthlySummary</w:t>
+      </w:r>
+    </w:p>
+    <w:p>
+      <w:r>
+        <w:t>• Target Users: Chief Executive Officer, Board of Directors, Finance Committee.</w:t>
+        <w:br/>
+        <w:t>• Grain: Calendar Year × Month.</w:t>
+        <w:br/>
+        <w:t>• Key Measures: TotalOrders (COUNT DISTINCT OrderBK), TotalRevenue (SUM TotalOrderValue), TotalFreightCosts (SUM FreightValue).</w:t>
+        <w:br/>
+        <w:t>• Validated Row Count: 24 monthly summary rows (2016–2018).</w:t>
+        <w:br/>
+        <w:t>• Purpose: High-level executive reporting on gross revenue growth, order volume trends, and shipping cost ratios.</w:t>
       </w:r>
     </w:p>
     <w:p>

</xml_diff>